<commit_message>
Adiciona build_exe.bat para gerar um scdp-uff.exe único, sem precisar de Python no computador de destino
- app.py: caminhos de templates/static/forms_config.json e do .env/banco
  passam a funcionar tanto rodando "python app.py" quanto dentro de um
  executável PyInstaller (sys.frozen / sys._MEIPASS); cria um .env padrão
  sozinho na primeira execução do .exe; abre o navegador automaticamente
  após o servidor subir (webbrowser, numa thread); use_reloader=False
  para funcionar dentro do executável empacotado.
- build_exe.bat: instala o PyInstaller e empacota app.py + templates +
  static + forms_config.json num único scdp-uff.exe. Testado de ponta a
  ponta (login, formulário, geração de documento Word) rodando o
  executável já empacotado antes de commitar.
- Guia de instalação e README atualizados com a nova opção (recomendada).
</commit_message>
<xml_diff>
--- a/GUIA_INSTALACAO_SCDP.docx
+++ b/GUIA_INSTALACAO_SCDP.docx
@@ -488,7 +488,7 @@
         <w:spacing w:after="160" w:before="360"/>
       </w:pPr>
       <w:r>
-        <w:t xml:space="preserve">Passo 3 — Criar o atalho na Área de Trabalho</w:t>
+        <w:t xml:space="preserve">Passo 3 — Deixe pronto para abrir com um clique</w:t>
       </w:r>
     </w:p>
     <w:p>
@@ -496,7 +496,7 @@
         <w:spacing w:after="160"/>
       </w:pPr>
       <w:r>
-        <w:t xml:space="preserve">Esse passo só precisa ser feito uma vez. Depois, o sistema abre com um duplo clique, como qualquer outro programa — sem precisar abrir pasta, terminal, VSCode ou qualquer outra ferramenta de programação.</w:t>
+        <w:t xml:space="preserve">Existem duas formas de chegar no mesmo resultado (um ícone que abre o sistema sozinho). A Opção A é a mais prática: gera um único arquivo .exe que dá para copiar para qualquer outro computador Windows, sem precisar instalar Python nele. A Opção B é mais simples de configurar, mas exige que o Python já esteja instalado em cada computador onde o sistema for usado.</w:t>
       </w:r>
     </w:p>
     <w:p>
@@ -505,68 +505,171 @@
         <w:spacing w:after="120" w:before="280"/>
       </w:pPr>
       <w:r>
-        <w:t xml:space="preserve">Opção simples (recomendada)</w:t>
-      </w:r>
-    </w:p>
-    <w:p>
-      <w:pPr>
-        <w:pStyle w:val="ListParagraph"/>
-        <w:numPr>
-          <w:ilvl w:val="0"/>
-          <w:numId w:val="2"/>
-        </w:numPr>
-        <w:spacing w:after="80"/>
-      </w:pPr>
-      <w:r>
-        <w:t xml:space="preserve">Abra a pasta scdp_afastamentos pelo Explorador de Arquivos do Windows.</w:t>
-      </w:r>
-    </w:p>
-    <w:p>
-      <w:pPr>
-        <w:pStyle w:val="ListParagraph"/>
-        <w:numPr>
-          <w:ilvl w:val="0"/>
-          <w:numId w:val="2"/>
-        </w:numPr>
-        <w:spacing w:after="80"/>
-      </w:pPr>
-      <w:r>
-        <w:t xml:space="preserve">Encontre o arquivo iniciar_sistema.bat (ícone de tela preta/engrenagem).</w:t>
-      </w:r>
-    </w:p>
-    <w:p>
-      <w:pPr>
-        <w:pStyle w:val="ListParagraph"/>
-        <w:numPr>
-          <w:ilvl w:val="0"/>
-          <w:numId w:val="2"/>
-        </w:numPr>
-        <w:spacing w:after="80"/>
-      </w:pPr>
-      <w:r>
-        <w:t xml:space="preserve">Clique com o botão direito nele → Enviar para → Área de trabalho (criar atalho).</w:t>
-      </w:r>
-    </w:p>
-    <w:p>
-      <w:pPr>
-        <w:pStyle w:val="ListParagraph"/>
-        <w:numPr>
-          <w:ilvl w:val="0"/>
-          <w:numId w:val="2"/>
-        </w:numPr>
-        <w:spacing w:after="80"/>
-      </w:pPr>
-      <w:r>
-        <w:t xml:space="preserve">Pronto — vai aparecer um atalho chamado "iniciar_sistema - Atalho" na sua Área de Trabalho. Pode renomear para "Sistema SCDP", se quiser (botão direito → Renomear).</w:t>
-      </w:r>
-    </w:p>
+        <w:t xml:space="preserve">Opção A — Gerar o scdp-uff.exe (recomendada)</w:t>
+      </w:r>
+    </w:p>
+    <w:p>
+      <w:pPr>
+        <w:spacing w:after="160"/>
+      </w:pPr>
+      <w:r>
+        <w:t xml:space="preserve">Esse passo só precisa ser feito uma vez, neste computador (que já tem o Python instalado, do Passo 1). O resultado é um único arquivo, scdp-uff.exe, que qualquer pessoa pode copiar para o computador dela e usar com um duplo clique — sem instalar Python, sem essa pasta toda, sem nada mais.</w:t>
+      </w:r>
+    </w:p>
+    <w:p>
+      <w:pPr>
+        <w:pStyle w:val="ListParagraph"/>
+        <w:numPr>
+          <w:ilvl w:val="0"/>
+          <w:numId w:val="2"/>
+        </w:numPr>
+        <w:spacing w:after="80"/>
+      </w:pPr>
+      <w:r>
+        <w:t xml:space="preserve">Abra a pasta scdp_afastamentos.</w:t>
+      </w:r>
+    </w:p>
+    <w:p>
+      <w:pPr>
+        <w:pStyle w:val="ListParagraph"/>
+        <w:numPr>
+          <w:ilvl w:val="0"/>
+          <w:numId w:val="2"/>
+        </w:numPr>
+        <w:spacing w:after="80"/>
+      </w:pPr>
+      <w:r>
+        <w:t xml:space="preserve">Dê dois cliques no arquivo build_exe.bat.</w:t>
+      </w:r>
+    </w:p>
+    <w:p>
+      <w:pPr>
+        <w:pStyle w:val="ListParagraph"/>
+        <w:numPr>
+          <w:ilvl w:val="0"/>
+          <w:numId w:val="2"/>
+        </w:numPr>
+        <w:spacing w:after="80"/>
+      </w:pPr>
+      <w:r>
+        <w:t xml:space="preserve">Uma janela preta vai aparecer e trabalhar sozinha por alguns minutos (ela baixa e empacota tudo o que o sistema precisa dentro do .exe). Não feche essa janela até ela avisar "Pronto!".</w:t>
+      </w:r>
+    </w:p>
+    <w:p>
+      <w:pPr>
+        <w:pStyle w:val="ListParagraph"/>
+        <w:numPr>
+          <w:ilvl w:val="0"/>
+          <w:numId w:val="2"/>
+        </w:numPr>
+        <w:spacing w:after="80"/>
+      </w:pPr>
+      <w:r>
+        <w:t xml:space="preserve">Ao terminar, vai existir um arquivo scdp-uff.exe dentro da pasta scdp_afastamentos.</w:t>
+      </w:r>
+    </w:p>
+    <w:p>
+      <w:pPr>
+        <w:pStyle w:val="ListParagraph"/>
+        <w:numPr>
+          <w:ilvl w:val="0"/>
+          <w:numId w:val="2"/>
+        </w:numPr>
+        <w:spacing w:after="80"/>
+      </w:pPr>
+      <w:r>
+        <w:t xml:space="preserve">Copie esse scdp-uff.exe para a Área de Trabalho (ou para onde preferir, inclusive um pendrive ou outro computador). A partir daí, é só dar dois cliques nele — não precisa mais desta pasta, do Python instalado, nem de mais nenhum passo deste guia nos outros computadores.</w:t>
+      </w:r>
+    </w:p>
+    <w:tbl>
+      <w:tblPr>
+        <w:tblW w:type="pct" w:w="100%"/>
+        <w:tblBorders>
+          <w:top w:val="single" w:color="auto" w:sz="4"/>
+          <w:left w:val="single" w:color="auto" w:sz="4"/>
+          <w:bottom w:val="single" w:color="auto" w:sz="4"/>
+          <w:right w:val="single" w:color="auto" w:sz="4"/>
+          <w:insideH w:val="single" w:color="auto" w:sz="4"/>
+          <w:insideV w:val="single" w:color="auto" w:sz="4"/>
+        </w:tblBorders>
+      </w:tblPr>
+      <w:tblGrid>
+        <w:gridCol w:w="9350"/>
+      </w:tblGrid>
+      <w:tr>
+        <w:tc>
+          <w:tcPr>
+            <w:tcW w:type="dxa" w:w="9350"/>
+            <w:tcBorders>
+              <w:top w:val="single" w:color="F0D9A8" w:sz="8"/>
+              <w:left w:val="single" w:color="F0D9A8" w:sz="8"/>
+              <w:bottom w:val="single" w:color="F0D9A8" w:sz="8"/>
+              <w:right w:val="single" w:color="F0D9A8" w:sz="8"/>
+            </w:tcBorders>
+            <w:shd w:fill="FFF7E6" w:val="clear"/>
+            <w:tcMar>
+              <w:top w:type="dxa" w:w="140"/>
+              <w:left w:type="dxa" w:w="200"/>
+              <w:bottom w:type="dxa" w:w="140"/>
+              <w:right w:type="dxa" w:w="200"/>
+            </w:tcMar>
+          </w:tcPr>
+          <w:p>
+            <w:pPr>
+              <w:spacing w:after="80"/>
+            </w:pPr>
+            <w:r>
+              <w:rPr>
+                <w:b/>
+                <w:bCs/>
+                <w:color w:val="7A5A12"/>
+              </w:rPr>
+              <w:t xml:space="preserve">Sobre o aviso do antivírus/Windows Defender</w:t>
+            </w:r>
+          </w:p>
+          <w:p>
+            <w:pPr>
+              <w:spacing w:after="40"/>
+            </w:pPr>
+            <w:r>
+              <w:rPr>
+                <w:color w:val="7A5A12"/>
+              </w:rPr>
+              <w:t xml:space="preserve">Como o scdp-uff.exe é um programa novo, sem "reputação" ainda conhecida pela Microsoft, é comum o Windows (ou o antivírus da instituição) mostrar um aviso ao abrir pela primeira vez.</w:t>
+            </w:r>
+          </w:p>
+          <w:p>
+            <w:pPr>
+              <w:spacing w:after="40"/>
+            </w:pPr>
+            <w:r>
+              <w:rPr>
+                <w:color w:val="7A5A12"/>
+              </w:rPr>
+              <w:t xml:space="preserve">Se aparecer uma tela azul "O Windows protegeu o computador", clique em "Mais informações" e depois em "Executar assim mesmo".</w:t>
+            </w:r>
+          </w:p>
+          <w:p>
+            <w:pPr>
+              <w:spacing w:after="40"/>
+            </w:pPr>
+            <w:r>
+              <w:rPr>
+                <w:color w:val="7A5A12"/>
+              </w:rPr>
+              <w:t xml:space="preserve">Se o antivírus da UFF bloquear de vez (em vez de só avisar), peça para o suporte de TI liberar o arquivo — não é um vírus, é só um programa ainda pouco conhecido por ali.</w:t>
+            </w:r>
+          </w:p>
+        </w:tc>
+      </w:tr>
+    </w:tbl>
     <w:p>
       <w:pPr>
         <w:pStyle w:val="Heading2"/>
         <w:spacing w:after="120" w:before="280"/>
       </w:pPr>
       <w:r>
-        <w:t xml:space="preserve">Opção com ícone mais bonito (alternativa)</w:t>
+        <w:t xml:space="preserve">Opção B — Atalho comum, sem gerar .exe (alternativa)</w:t>
       </w:r>
     </w:p>
     <w:p>
@@ -574,59 +677,67 @@
         <w:spacing w:after="160"/>
       </w:pPr>
       <w:r>
-        <w:t xml:space="preserve">Se preferir um atalho com nome e ícone já prontos, o mesmo resultado sai automaticamente rodando um script incluído na pasta:</w:t>
-      </w:r>
-    </w:p>
-    <w:p>
-      <w:pPr>
-        <w:pStyle w:val="ListParagraph"/>
-        <w:numPr>
-          <w:ilvl w:val="0"/>
-          <w:numId w:val="2"/>
-        </w:numPr>
-        <w:spacing w:after="80"/>
-      </w:pPr>
-      <w:r>
-        <w:t xml:space="preserve">Clique com o botão direito no arquivo criar_atalho.ps1 → Executar com o PowerShell.</w:t>
-      </w:r>
-    </w:p>
-    <w:p>
-      <w:pPr>
-        <w:pStyle w:val="ListParagraph"/>
-        <w:numPr>
-          <w:ilvl w:val="0"/>
-          <w:numId w:val="2"/>
-        </w:numPr>
-        <w:spacing w:after="80"/>
-      </w:pPr>
-      <w:r>
-        <w:t xml:space="preserve">Se o Windows mostrar um aviso azul de segurança ("O Windows protegeu o computador"), clique em "Mais informações" e depois em "Executar assim mesmo" — isso acontece porque o script não tem uma assinatura digital paga, é normal para scripts internos como este.</w:t>
-      </w:r>
-    </w:p>
-    <w:p>
-      <w:pPr>
-        <w:pStyle w:val="ListParagraph"/>
-        <w:numPr>
-          <w:ilvl w:val="0"/>
-          <w:numId w:val="2"/>
-        </w:numPr>
-        <w:spacing w:after="80"/>
-      </w:pPr>
-      <w:r>
-        <w:t xml:space="preserve">Uma janela preta vai avisar "Pronto! Foi criado o atalho...". É só apertar Enter para fechar.</w:t>
-      </w:r>
-    </w:p>
-    <w:p>
-      <w:pPr>
-        <w:pStyle w:val="ListParagraph"/>
-        <w:numPr>
-          <w:ilvl w:val="0"/>
-          <w:numId w:val="2"/>
-        </w:numPr>
-        <w:spacing w:after="80"/>
-      </w:pPr>
-      <w:r>
-        <w:t xml:space="preserve">O atalho "Sistema SCDP - Afastamentos" vai aparecer na Área de Trabalho.</w:t>
+        <w:t xml:space="preserve">Use esta opção se preferir não gerar o .exe, ou se quiser abrir o sistema sempre a partir desta mesma pasta e deste mesmo computador.</w:t>
+      </w:r>
+    </w:p>
+    <w:p>
+      <w:pPr>
+        <w:pStyle w:val="ListParagraph"/>
+        <w:numPr>
+          <w:ilvl w:val="0"/>
+          <w:numId w:val="2"/>
+        </w:numPr>
+        <w:spacing w:after="80"/>
+      </w:pPr>
+      <w:r>
+        <w:t xml:space="preserve">Abra a pasta scdp_afastamentos pelo Explorador de Arquivos do Windows.</w:t>
+      </w:r>
+    </w:p>
+    <w:p>
+      <w:pPr>
+        <w:pStyle w:val="ListParagraph"/>
+        <w:numPr>
+          <w:ilvl w:val="0"/>
+          <w:numId w:val="2"/>
+        </w:numPr>
+        <w:spacing w:after="80"/>
+      </w:pPr>
+      <w:r>
+        <w:t xml:space="preserve">Encontre o arquivo iniciar_sistema.bat (ícone de tela preta/engrenagem).</w:t>
+      </w:r>
+    </w:p>
+    <w:p>
+      <w:pPr>
+        <w:pStyle w:val="ListParagraph"/>
+        <w:numPr>
+          <w:ilvl w:val="0"/>
+          <w:numId w:val="2"/>
+        </w:numPr>
+        <w:spacing w:after="80"/>
+      </w:pPr>
+      <w:r>
+        <w:t xml:space="preserve">Clique com o botão direito nele → Enviar para → Área de trabalho (criar atalho).</w:t>
+      </w:r>
+    </w:p>
+    <w:p>
+      <w:pPr>
+        <w:pStyle w:val="ListParagraph"/>
+        <w:numPr>
+          <w:ilvl w:val="0"/>
+          <w:numId w:val="2"/>
+        </w:numPr>
+        <w:spacing w:after="80"/>
+      </w:pPr>
+      <w:r>
+        <w:t xml:space="preserve">Pronto — vai aparecer um atalho chamado "iniciar_sistema - Atalho" na sua Área de Trabalho. Pode renomear para "Sistema SCDP", se quiser (botão direito → Renomear).</w:t>
+      </w:r>
+    </w:p>
+    <w:p>
+      <w:pPr>
+        <w:spacing w:after="160"/>
+      </w:pPr>
+      <w:r>
+        <w:t xml:space="preserve">Também existe uma variante com ícone mais bonito pronto (script criar_atalho.ps1, botão direito → Executar com o PowerShell), que faz a mesma coisa automaticamente.</w:t>
       </w:r>
     </w:p>
     <w:p>
@@ -673,20 +784,20 @@
         <w:spacing w:after="80"/>
       </w:pPr>
       <w:r>
-        <w:t xml:space="preserve">Dê dois cliques no atalho criado no Passo 3.</w:t>
-      </w:r>
-    </w:p>
-    <w:p>
-      <w:pPr>
-        <w:pStyle w:val="ListParagraph"/>
-        <w:numPr>
-          <w:ilvl w:val="0"/>
-          <w:numId w:val="2"/>
-        </w:numPr>
-        <w:spacing w:after="80"/>
-      </w:pPr>
-      <w:r>
-        <w:t xml:space="preserve">Na primeira vez, uma janela preta vai aparecer preparando tudo (baixando as peças internas do sistema) — isso pode levar de 1 a 3 minutos e só acontece uma vez. Não feche essa janela.</w:t>
+        <w:t xml:space="preserve">Dê dois cliques no scdp-uff.exe (Opção A) ou no atalho criado no Passo 3 (Opção B).</w:t>
+      </w:r>
+    </w:p>
+    <w:p>
+      <w:pPr>
+        <w:pStyle w:val="ListParagraph"/>
+        <w:numPr>
+          <w:ilvl w:val="0"/>
+          <w:numId w:val="2"/>
+        </w:numPr>
+        <w:spacing w:after="80"/>
+      </w:pPr>
+      <w:r>
+        <w:t xml:space="preserve">Na primeira vez (só na Opção B — na Opção A isso já aconteceu durante a geração do .exe), uma janela preta vai aparecer preparando tudo — isso pode levar de 1 a 3 minutos e só acontece uma vez. Não feche essa janela.</w:t>
       </w:r>
     </w:p>
     <w:p>
@@ -1077,7 +1188,7 @@
         <w:spacing w:after="120" w:before="280"/>
       </w:pPr>
       <w:r>
-        <w:t xml:space="preserve">Preciso reinstalar tudo do zero</w:t>
+        <w:t xml:space="preserve">Preciso reinstalar tudo do zero (Opção B)</w:t>
       </w:r>
     </w:p>
     <w:p>
@@ -1104,6 +1215,59 @@
       </w:r>
       <w:r>
         <w:t xml:space="preserve"> e abra o sistema pelo atalho de novo — ele recria tudo sozinho, como da primeira vez.</w:t>
+      </w:r>
+    </w:p>
+    <w:p>
+      <w:pPr>
+        <w:pStyle w:val="Heading2"/>
+        <w:spacing w:after="120" w:before="280"/>
+      </w:pPr>
+      <w:r>
+        <w:t xml:space="preserve">Quero gerar o scdp-uff.exe de novo, do zero (Opção A)</w:t>
+      </w:r>
+    </w:p>
+    <w:p>
+      <w:pPr>
+        <w:spacing w:after="160"/>
+      </w:pPr>
+      <w:r>
+        <w:t xml:space="preserve">Apague o </w:t>
+      </w:r>
+      <w:r>
+        <w:rPr>
+          <w:rFonts w:ascii="Consolas" w:cs="Consolas" w:eastAsia="Consolas" w:hAnsi="Consolas"/>
+        </w:rPr>
+        <w:t xml:space="preserve">scdp-uff.exe</w:t>
+      </w:r>
+      <w:r>
+        <w:t xml:space="preserve"> e a pasta </w:t>
+      </w:r>
+      <w:r>
+        <w:rPr>
+          <w:rFonts w:ascii="Consolas" w:cs="Consolas" w:eastAsia="Consolas" w:hAnsi="Consolas"/>
+        </w:rPr>
+        <w:t xml:space="preserve">venv</w:t>
+      </w:r>
+      <w:r>
+        <w:t xml:space="preserve"> dentro de </w:t>
+      </w:r>
+      <w:r>
+        <w:rPr>
+          <w:rFonts w:ascii="Consolas" w:cs="Consolas" w:eastAsia="Consolas" w:hAnsi="Consolas"/>
+        </w:rPr>
+        <w:t xml:space="preserve">scdp_afastamentos</w:t>
+      </w:r>
+      <w:r>
+        <w:t xml:space="preserve">, e rode o </w:t>
+      </w:r>
+      <w:r>
+        <w:rPr>
+          <w:rFonts w:ascii="Consolas" w:cs="Consolas" w:eastAsia="Consolas" w:hAnsi="Consolas"/>
+        </w:rPr>
+        <w:t xml:space="preserve">build_exe.bat</w:t>
+      </w:r>
+      <w:r>
+        <w:t xml:space="preserve"> de novo.</w:t>
       </w:r>
     </w:p>
     <w:p>
@@ -1125,7 +1289,7 @@
         <w:spacing w:after="80"/>
       </w:pPr>
       <w:r>
-        <w:t xml:space="preserve">Dê dois cliques no atalho na Área de Trabalho.</w:t>
+        <w:t xml:space="preserve">Dê dois cliques no scdp-uff.exe (ou no atalho, se estiver usando a Opção B).</w:t>
       </w:r>
     </w:p>
     <w:p>

</xml_diff>